<commit_message>
fix: complete Phase 3: Font metrics, DOCX and PDF, and fixes for pasting and collaboration
</commit_message>
<xml_diff>
--- a/fixtures/docx/exports/docx-t1-paragraph-formatting.docx
+++ b/fixtures/docx/exports/docx-t1-paragraph-formatting.docx
@@ -5,9 +5,9 @@
     <w:p>
       <w:pPr>
         <w:pStyle w:val="Normal"/>
-        <w:jc w:val="center"/>
         <w:spacing w:before="240" w:after="120" w:line="360" w:lineRule="auto"/>
         <w:ind w:left="720" w:firstLine="360"/>
+        <w:jc w:val="center"/>
       </w:pPr>
       <w:r>
         <w:t>Formatted paragraph</w:t>
@@ -16,9 +16,9 @@
     <w:p>
       <w:pPr>
         <w:pStyle w:val="Normal"/>
-        <w:jc w:val="right"/>
         <w:spacing w:before="60" w:after="180" w:line="480" w:lineRule="auto"/>
         <w:ind w:left="960" w:hanging="240"/>
+        <w:jc w:val="right"/>
       </w:pPr>
       <w:r>
         <w:t>Hanging paragraph</w:t>

</xml_diff>